<commit_message>
Update lab 1 report
</commit_message>
<xml_diff>
--- a/Івахненко_ЛР1.docx
+++ b/Івахненко_ЛР1.docx
@@ -65,8 +65,6 @@
           <w:lang w:val="ru-RU"/>
         </w:rPr>
       </w:pPr>
-      <w:proofErr w:type="spellStart"/>
-      <w:proofErr w:type="gramStart"/>
       <w:r>
         <w:rPr>
           <w:rFonts w:cs="Times New Roman"/>
@@ -76,31 +74,7 @@
           <w:szCs w:val="28"/>
           <w:lang w:val="ru-RU"/>
         </w:rPr>
-        <w:t>імені</w:t>
-      </w:r>
-      <w:proofErr w:type="spellEnd"/>
-      <w:r>
-        <w:rPr>
-          <w:rFonts w:cs="Times New Roman"/>
-          <w:b/>
-          <w:bCs/>
-          <w:sz w:val="28"/>
-          <w:szCs w:val="28"/>
-          <w:lang w:val="ru-RU"/>
-        </w:rPr>
-        <w:t xml:space="preserve">  ІГОРЯ</w:t>
-      </w:r>
-      <w:proofErr w:type="gramEnd"/>
-      <w:r>
-        <w:rPr>
-          <w:rFonts w:cs="Times New Roman"/>
-          <w:b/>
-          <w:bCs/>
-          <w:sz w:val="28"/>
-          <w:szCs w:val="28"/>
-          <w:lang w:val="ru-RU"/>
-        </w:rPr>
-        <w:t xml:space="preserve"> СІКОРСЬКОГО”</w:t>
+        <w:t>імені  ІГОРЯ СІКОРСЬКОГО”</w:t>
       </w:r>
     </w:p>
     <w:p>
@@ -214,29 +188,7 @@
           <w:szCs w:val="28"/>
           <w:lang w:val="uk-UA"/>
         </w:rPr>
-        <w:t>з дисципліни «</w:t>
-      </w:r>
-      <w:r>
-        <w:rPr>
-          <w:rFonts w:cs="Times New Roman"/>
-          <w:b/>
-          <w:bCs/>
-          <w:sz w:val="28"/>
-          <w:szCs w:val="28"/>
-          <w:lang w:val="uk-UA"/>
-        </w:rPr>
-        <w:t>Програмне забезпечення енергетичного менеджменту</w:t>
-      </w:r>
-      <w:r>
-        <w:rPr>
-          <w:rFonts w:cs="Times New Roman"/>
-          <w:b/>
-          <w:bCs/>
-          <w:sz w:val="28"/>
-          <w:szCs w:val="28"/>
-          <w:lang w:val="uk-UA"/>
-        </w:rPr>
-        <w:t>»</w:t>
+        <w:t>з дисципліни «Програмне забезпечення енергетичного менеджменту»</w:t>
       </w:r>
     </w:p>
     <w:p>
@@ -261,42 +213,7 @@
           <w:szCs w:val="28"/>
           <w:lang w:val="uk-UA"/>
         </w:rPr>
-        <w:t>ТЕМА: «</w:t>
-      </w:r>
-      <w:proofErr w:type="spellStart"/>
-      <w:r>
-        <w:rPr>
-          <w:rFonts w:cs="Times New Roman"/>
-          <w:b/>
-          <w:bCs/>
-          <w:sz w:val="28"/>
-          <w:szCs w:val="28"/>
-          <w:lang w:val="uk-UA"/>
-        </w:rPr>
-        <w:t>Проєктування</w:t>
-      </w:r>
-      <w:proofErr w:type="spellEnd"/>
-      <w:r>
-        <w:rPr>
-          <w:rFonts w:cs="Times New Roman"/>
-          <w:b/>
-          <w:bCs/>
-          <w:sz w:val="28"/>
-          <w:szCs w:val="28"/>
-          <w:lang w:val="uk-UA"/>
-        </w:rPr>
-        <w:t xml:space="preserve"> системи збереження та збору даних</w:t>
-      </w:r>
-      <w:r>
-        <w:rPr>
-          <w:rFonts w:cs="Times New Roman"/>
-          <w:b/>
-          <w:bCs/>
-          <w:sz w:val="28"/>
-          <w:szCs w:val="28"/>
-          <w:lang w:val="uk-UA"/>
-        </w:rPr>
-        <w:t>»</w:t>
+        <w:t>ТЕМА: «Проєктування системи збереження та збору даних»</w:t>
       </w:r>
     </w:p>
     <w:p>
@@ -390,7 +307,6 @@
           <w:lang w:val="ru-RU"/>
         </w:rPr>
       </w:pPr>
-      <w:proofErr w:type="spellStart"/>
       <w:r>
         <w:rPr>
           <w:rFonts w:cs="Times New Roman"/>
@@ -401,7 +317,6 @@
         </w:rPr>
         <w:t>Викона</w:t>
       </w:r>
-      <w:proofErr w:type="spellEnd"/>
       <w:r>
         <w:rPr>
           <w:rFonts w:cs="Times New Roman"/>
@@ -420,20 +335,8 @@
           <w:szCs w:val="28"/>
           <w:lang w:val="ru-RU"/>
         </w:rPr>
-        <w:t xml:space="preserve"> студентка </w:t>
+        <w:t xml:space="preserve"> студентка групи</w:t>
       </w:r>
-      <w:proofErr w:type="spellStart"/>
-      <w:r>
-        <w:rPr>
-          <w:rFonts w:cs="Times New Roman"/>
-          <w:bCs/>
-          <w:sz w:val="28"/>
-          <w:szCs w:val="28"/>
-          <w:lang w:val="ru-RU"/>
-        </w:rPr>
-        <w:t>групи</w:t>
-      </w:r>
-      <w:proofErr w:type="spellEnd"/>
     </w:p>
     <w:p>
       <w:pPr>
@@ -458,7 +361,6 @@
         </w:rPr>
         <w:t xml:space="preserve">ТР-51мп </w:t>
       </w:r>
-      <w:proofErr w:type="spellStart"/>
       <w:r>
         <w:rPr>
           <w:rFonts w:cs="Times New Roman"/>
@@ -467,23 +369,12 @@
           <w:szCs w:val="28"/>
           <w:lang w:val="ru-RU" w:eastAsia="zh-CN" w:bidi="ar"/>
         </w:rPr>
-        <w:t>Івахненко</w:t>
-      </w:r>
-      <w:proofErr w:type="spellEnd"/>
-      <w:r>
-        <w:rPr>
-          <w:rFonts w:cs="Times New Roman"/>
-          <w:color w:val="000000"/>
-          <w:sz w:val="28"/>
-          <w:szCs w:val="28"/>
-          <w:lang w:val="ru-RU" w:eastAsia="zh-CN" w:bidi="ar"/>
-        </w:rPr>
-        <w:t xml:space="preserve"> Ю. О.</w:t>
+        <w:t>Івахненко Ю. О.</w:t>
       </w:r>
     </w:p>
     <w:p>
       <w:pPr>
-        <w:spacing w:line="240" w:lineRule="auto"/>
+        <w:spacing w:before="240" w:line="240" w:lineRule="auto"/>
         <w:ind w:firstLine="5529"/>
         <w:jc w:val="center"/>
         <w:rPr>
@@ -494,7 +385,6 @@
           <w:lang w:val="uk-UA"/>
         </w:rPr>
       </w:pPr>
-      <w:proofErr w:type="spellStart"/>
       <w:r>
         <w:rPr>
           <w:rFonts w:cs="Times New Roman"/>
@@ -505,7 +395,6 @@
         </w:rPr>
         <w:t>Перевіри</w:t>
       </w:r>
-      <w:proofErr w:type="spellEnd"/>
       <w:r>
         <w:rPr>
           <w:rFonts w:cs="Times New Roman"/>
@@ -514,7 +403,47 @@
           <w:szCs w:val="28"/>
           <w:lang w:val="uk-UA"/>
         </w:rPr>
-        <w:t>в Волков О. В.</w:t>
+        <w:t xml:space="preserve">в </w:t>
+      </w:r>
+      <w:r>
+        <w:rPr>
+          <w:rFonts w:cs="Times New Roman"/>
+          <w:bCs/>
+          <w:sz w:val="28"/>
+          <w:szCs w:val="28"/>
+          <w:lang w:val="uk-UA"/>
+        </w:rPr>
+        <w:t>Головакін М</w:t>
+      </w:r>
+      <w:r>
+        <w:rPr>
+          <w:rFonts w:cs="Times New Roman"/>
+          <w:bCs/>
+          <w:sz w:val="28"/>
+          <w:szCs w:val="28"/>
+          <w:lang w:val="uk-UA"/>
+        </w:rPr>
+        <w:t xml:space="preserve">. </w:t>
+      </w:r>
+      <w:r>
+        <w:rPr>
+          <w:rFonts w:cs="Times New Roman"/>
+          <w:bCs/>
+          <w:sz w:val="28"/>
+          <w:szCs w:val="28"/>
+          <w:lang w:val="uk-UA"/>
+        </w:rPr>
+        <w:t>А</w:t>
+      </w:r>
+      <w:r>
+        <w:rPr>
+          <w:rFonts w:cs="Times New Roman"/>
+          <w:bCs/>
+          <w:sz w:val="28"/>
+          <w:szCs w:val="28"/>
+          <w:lang w:val="uk-UA"/>
+        </w:rPr>
+        <w:t>.</w:t>
       </w:r>
     </w:p>
     <w:p>
@@ -608,12 +537,10 @@
             <w:pPr>
               <w:jc w:val="both"/>
             </w:pPr>
-            <w:proofErr w:type="spellStart"/>
             <w:r>
               <w:lastRenderedPageBreak/>
               <w:t>Об’єкт</w:t>
             </w:r>
-            <w:proofErr w:type="spellEnd"/>
           </w:p>
         </w:tc>
         <w:tc>
@@ -919,67 +846,13 @@
           <w:szCs w:val="28"/>
         </w:rPr>
       </w:pPr>
-      <w:proofErr w:type="spellStart"/>
       <w:r>
         <w:rPr>
           <w:rFonts w:cs="Times New Roman"/>
           <w:sz w:val="28"/>
           <w:szCs w:val="28"/>
         </w:rPr>
-        <w:t>Метою</w:t>
-      </w:r>
-      <w:proofErr w:type="spellEnd"/>
-      <w:r>
-        <w:rPr>
-          <w:rFonts w:cs="Times New Roman"/>
-          <w:sz w:val="28"/>
-          <w:szCs w:val="28"/>
-        </w:rPr>
-        <w:t xml:space="preserve"> </w:t>
-      </w:r>
-      <w:proofErr w:type="spellStart"/>
-      <w:r>
-        <w:rPr>
-          <w:rFonts w:cs="Times New Roman"/>
-          <w:sz w:val="28"/>
-          <w:szCs w:val="28"/>
-        </w:rPr>
-        <w:t>роботи</w:t>
-      </w:r>
-      <w:proofErr w:type="spellEnd"/>
-      <w:r>
-        <w:rPr>
-          <w:rFonts w:cs="Times New Roman"/>
-          <w:sz w:val="28"/>
-          <w:szCs w:val="28"/>
-        </w:rPr>
-        <w:t xml:space="preserve"> є </w:t>
-      </w:r>
-      <w:proofErr w:type="spellStart"/>
-      <w:r>
-        <w:rPr>
-          <w:rFonts w:cs="Times New Roman"/>
-          <w:sz w:val="28"/>
-          <w:szCs w:val="28"/>
-        </w:rPr>
-        <w:t>проєктування</w:t>
-      </w:r>
-      <w:proofErr w:type="spellEnd"/>
-      <w:r>
-        <w:rPr>
-          <w:rFonts w:cs="Times New Roman"/>
-          <w:sz w:val="28"/>
-          <w:szCs w:val="28"/>
-        </w:rPr>
-        <w:t xml:space="preserve"> та реалізація </w:t>
-      </w:r>
-      <w:r>
-        <w:rPr>
-          <w:rFonts w:cs="Times New Roman"/>
-          <w:sz w:val="28"/>
-          <w:szCs w:val="28"/>
-        </w:rPr>
-        <w:t>реляційного сховища даних для трирівневого обліку енергоспоживання лабораторії. Система повинна зберігати погодинні дані щонайменше за один рік, підтримувати облік за рівнями 1, 2, 3, метеорологічні фактори, тарифні зони, baseline та базову аналітику.</w:t>
+        <w:t>Метою роботи є проєктування та реалізація реляційного сховища даних для трирівневого обліку енергоспоживання лабораторії. Система повинна зберігати погодинні дані щонайменше за один рік, підтримувати облік за рівнями 1, 2, 3, метеорологічні фактори, тарифні зони, baseline та базову аналітику.</w:t>
       </w:r>
     </w:p>
     <w:p>
@@ -993,149 +866,13 @@
           <w:szCs w:val="28"/>
         </w:rPr>
       </w:pPr>
-      <w:proofErr w:type="spellStart"/>
       <w:r>
         <w:rPr>
           <w:rFonts w:cs="Times New Roman"/>
           <w:sz w:val="28"/>
           <w:szCs w:val="28"/>
         </w:rPr>
-        <w:t>Для</w:t>
-      </w:r>
-      <w:proofErr w:type="spellEnd"/>
-      <w:r>
-        <w:rPr>
-          <w:rFonts w:cs="Times New Roman"/>
-          <w:sz w:val="28"/>
-          <w:szCs w:val="28"/>
-        </w:rPr>
-        <w:t xml:space="preserve"> </w:t>
-      </w:r>
-      <w:proofErr w:type="spellStart"/>
-      <w:r>
-        <w:rPr>
-          <w:rFonts w:cs="Times New Roman"/>
-          <w:sz w:val="28"/>
-          <w:szCs w:val="28"/>
-        </w:rPr>
-        <w:t>реалізації</w:t>
-      </w:r>
-      <w:proofErr w:type="spellEnd"/>
-      <w:r>
-        <w:rPr>
-          <w:rFonts w:cs="Times New Roman"/>
-          <w:sz w:val="28"/>
-          <w:szCs w:val="28"/>
-        </w:rPr>
-        <w:t xml:space="preserve"> </w:t>
-      </w:r>
-      <w:proofErr w:type="spellStart"/>
-      <w:r>
-        <w:rPr>
-          <w:rFonts w:cs="Times New Roman"/>
-          <w:sz w:val="28"/>
-          <w:szCs w:val="28"/>
-        </w:rPr>
-        <w:t>обрано</w:t>
-      </w:r>
-      <w:proofErr w:type="spellEnd"/>
-      <w:r>
-        <w:rPr>
-          <w:rFonts w:cs="Times New Roman"/>
-          <w:sz w:val="28"/>
-          <w:szCs w:val="28"/>
-        </w:rPr>
-        <w:t xml:space="preserve"> </w:t>
-      </w:r>
-      <w:proofErr w:type="spellStart"/>
-      <w:r>
-        <w:rPr>
-          <w:rFonts w:cs="Times New Roman"/>
-          <w:sz w:val="28"/>
-          <w:szCs w:val="28"/>
-        </w:rPr>
-        <w:t>трек</w:t>
-      </w:r>
-      <w:proofErr w:type="spellEnd"/>
-      <w:r>
-        <w:rPr>
-          <w:rFonts w:cs="Times New Roman"/>
-          <w:sz w:val="28"/>
-          <w:szCs w:val="28"/>
-        </w:rPr>
-        <w:t xml:space="preserve"> А: класична реляційна система на SQLite. Такий варіант зручний для навчальної лабораторної роботи, не потребує окремого сервера БД і дозволяє </w:t>
-      </w:r>
-      <w:proofErr w:type="spellStart"/>
-      <w:r>
-        <w:rPr>
-          <w:rFonts w:cs="Times New Roman"/>
-          <w:sz w:val="28"/>
-          <w:szCs w:val="28"/>
-        </w:rPr>
-        <w:t>запускати</w:t>
-      </w:r>
-      <w:proofErr w:type="spellEnd"/>
-      <w:r>
-        <w:rPr>
-          <w:rFonts w:cs="Times New Roman"/>
-          <w:sz w:val="28"/>
-          <w:szCs w:val="28"/>
-        </w:rPr>
-        <w:t xml:space="preserve"> </w:t>
-      </w:r>
-      <w:proofErr w:type="spellStart"/>
-      <w:r>
-        <w:rPr>
-          <w:rFonts w:cs="Times New Roman"/>
-          <w:sz w:val="28"/>
-          <w:szCs w:val="28"/>
-        </w:rPr>
-        <w:t>всі</w:t>
-      </w:r>
-      <w:proofErr w:type="spellEnd"/>
-      <w:r>
-        <w:rPr>
-          <w:rFonts w:cs="Times New Roman"/>
-          <w:sz w:val="28"/>
-          <w:szCs w:val="28"/>
-        </w:rPr>
-        <w:t xml:space="preserve"> SQL-</w:t>
-      </w:r>
-      <w:proofErr w:type="spellStart"/>
-      <w:r>
-        <w:rPr>
-          <w:rFonts w:cs="Times New Roman"/>
-          <w:sz w:val="28"/>
-          <w:szCs w:val="28"/>
-        </w:rPr>
-        <w:t>запити</w:t>
-      </w:r>
-      <w:proofErr w:type="spellEnd"/>
-      <w:r>
-        <w:rPr>
-          <w:rFonts w:cs="Times New Roman"/>
-          <w:sz w:val="28"/>
-          <w:szCs w:val="28"/>
-        </w:rPr>
-        <w:t xml:space="preserve"> </w:t>
-      </w:r>
-      <w:proofErr w:type="spellStart"/>
-      <w:r>
-        <w:rPr>
-          <w:rFonts w:cs="Times New Roman"/>
-          <w:sz w:val="28"/>
-          <w:szCs w:val="28"/>
-        </w:rPr>
-        <w:t>локально</w:t>
-      </w:r>
-      <w:proofErr w:type="spellEnd"/>
-      <w:r>
-        <w:rPr>
-          <w:rFonts w:cs="Times New Roman"/>
-          <w:sz w:val="28"/>
-          <w:szCs w:val="28"/>
-        </w:rPr>
-        <w:t>.</w:t>
+        <w:t>Для реалізації обрано трек А: класична реляційна система на SQLite. Такий варіант зручний для навчальної лабораторної роботи, не потребує окремого сервера БД і дозволяє запускати всі SQL-запити локально.</w:t>
       </w:r>
     </w:p>
     <w:p>
@@ -1149,7 +886,6 @@
           <w:sz w:val="28"/>
         </w:rPr>
       </w:pPr>
-      <w:proofErr w:type="spellStart"/>
       <w:r>
         <w:rPr>
           <w:rFonts w:ascii="Times New Roman" w:hAnsi="Times New Roman" w:cs="Times New Roman"/>
@@ -1157,27 +893,8 @@
           <w:sz w:val="28"/>
         </w:rPr>
         <w:lastRenderedPageBreak/>
-        <w:t>Структура</w:t>
+        <w:t>Структура даних</w:t>
       </w:r>
-      <w:proofErr w:type="spellEnd"/>
-      <w:r>
-        <w:rPr>
-          <w:rFonts w:ascii="Times New Roman" w:hAnsi="Times New Roman" w:cs="Times New Roman"/>
-          <w:color w:val="000000" w:themeColor="text1"/>
-          <w:sz w:val="28"/>
-        </w:rPr>
-        <w:t xml:space="preserve"> </w:t>
-      </w:r>
-      <w:proofErr w:type="spellStart"/>
-      <w:r>
-        <w:rPr>
-          <w:rFonts w:ascii="Times New Roman" w:hAnsi="Times New Roman" w:cs="Times New Roman"/>
-          <w:color w:val="000000" w:themeColor="text1"/>
-          <w:sz w:val="28"/>
-        </w:rPr>
-        <w:t>даних</w:t>
-      </w:r>
-      <w:proofErr w:type="spellEnd"/>
     </w:p>
     <w:p>
       <w:pPr>
@@ -1284,7 +1001,6 @@
                                   <w:szCs w:val="28"/>
                                 </w:rPr>
                               </w:pPr>
-                              <w:proofErr w:type="spellStart"/>
                               <w:r>
                                 <w:rPr>
                                   <w:rFonts w:cs="Times New Roman"/>
@@ -1292,89 +1008,8 @@
                                   <w:sz w:val="28"/>
                                   <w:szCs w:val="28"/>
                                 </w:rPr>
-                                <w:t>Рисунок</w:t>
+                                <w:t>Рисунок 1 — Логічна схема бази даних</w:t>
                               </w:r>
-                              <w:proofErr w:type="spellEnd"/>
-                              <w:r>
-                                <w:rPr>
-                                  <w:rFonts w:cs="Times New Roman"/>
-                                  <w:i/>
-                                  <w:sz w:val="28"/>
-                                  <w:szCs w:val="28"/>
-                                </w:rPr>
-                                <w:t xml:space="preserve"> 1 — </w:t>
-                              </w:r>
-                              <w:proofErr w:type="spellStart"/>
-                              <w:r>
-                                <w:rPr>
-                                  <w:rFonts w:cs="Times New Roman"/>
-                                  <w:i/>
-                                  <w:sz w:val="28"/>
-                                  <w:szCs w:val="28"/>
-                                </w:rPr>
-                                <w:t>Логічна</w:t>
-                              </w:r>
-                              <w:proofErr w:type="spellEnd"/>
-                              <w:r>
-                                <w:rPr>
-                                  <w:rFonts w:cs="Times New Roman"/>
-                                  <w:i/>
-                                  <w:sz w:val="28"/>
-                                  <w:szCs w:val="28"/>
-                                </w:rPr>
-                                <w:t xml:space="preserve"> </w:t>
-                              </w:r>
-                              <w:proofErr w:type="spellStart"/>
-                              <w:r>
-                                <w:rPr>
-                                  <w:rFonts w:cs="Times New Roman"/>
-                                  <w:i/>
-                                  <w:sz w:val="28"/>
-                                  <w:szCs w:val="28"/>
-                                </w:rPr>
-                                <w:t>схема</w:t>
-                              </w:r>
-                              <w:proofErr w:type="spellEnd"/>
-                              <w:r>
-                                <w:rPr>
-                                  <w:rFonts w:cs="Times New Roman"/>
-                                  <w:i/>
-                                  <w:sz w:val="28"/>
-                                  <w:szCs w:val="28"/>
-                                </w:rPr>
-                                <w:t xml:space="preserve"> </w:t>
-                              </w:r>
-                              <w:proofErr w:type="spellStart"/>
-                              <w:r>
-                                <w:rPr>
-                                  <w:rFonts w:cs="Times New Roman"/>
-                                  <w:i/>
-                                  <w:sz w:val="28"/>
-                                  <w:szCs w:val="28"/>
-                                </w:rPr>
-                                <w:t>бази</w:t>
-                              </w:r>
-                              <w:proofErr w:type="spellEnd"/>
-                              <w:r>
-                                <w:rPr>
-                                  <w:rFonts w:cs="Times New Roman"/>
-                                  <w:i/>
-                                  <w:sz w:val="28"/>
-                                  <w:szCs w:val="28"/>
-                                </w:rPr>
-                                <w:t xml:space="preserve"> </w:t>
-                              </w:r>
-                              <w:proofErr w:type="spellStart"/>
-                              <w:r>
-                                <w:rPr>
-                                  <w:rFonts w:cs="Times New Roman"/>
-                                  <w:i/>
-                                  <w:sz w:val="28"/>
-                                  <w:szCs w:val="28"/>
-                                </w:rPr>
-                                <w:t>даних</w:t>
-                              </w:r>
-                              <w:proofErr w:type="spellEnd"/>
                             </w:p>
                           </w:txbxContent>
                         </wps:txbx>
@@ -1541,219 +1176,13 @@
           </mc:Fallback>
         </mc:AlternateContent>
       </w:r>
-      <w:proofErr w:type="spellStart"/>
       <w:r>
         <w:rPr>
           <w:rFonts w:cs="Times New Roman"/>
           <w:sz w:val="28"/>
           <w:szCs w:val="28"/>
         </w:rPr>
-        <w:t>Сховище</w:t>
-      </w:r>
-      <w:proofErr w:type="spellEnd"/>
-      <w:r>
-        <w:rPr>
-          <w:rFonts w:cs="Times New Roman"/>
-          <w:sz w:val="28"/>
-          <w:szCs w:val="28"/>
-        </w:rPr>
-        <w:t xml:space="preserve"> </w:t>
-      </w:r>
-      <w:proofErr w:type="spellStart"/>
-      <w:r>
-        <w:rPr>
-          <w:rFonts w:cs="Times New Roman"/>
-          <w:sz w:val="28"/>
-          <w:szCs w:val="28"/>
-        </w:rPr>
-        <w:t>нормалізовано</w:t>
-      </w:r>
-      <w:proofErr w:type="spellEnd"/>
-      <w:r>
-        <w:rPr>
-          <w:rFonts w:cs="Times New Roman"/>
-          <w:sz w:val="28"/>
-          <w:szCs w:val="28"/>
-        </w:rPr>
-        <w:t xml:space="preserve"> </w:t>
-      </w:r>
-      <w:proofErr w:type="spellStart"/>
-      <w:r>
-        <w:rPr>
-          <w:rFonts w:cs="Times New Roman"/>
-          <w:sz w:val="28"/>
-          <w:szCs w:val="28"/>
-        </w:rPr>
-        <w:t>на</w:t>
-      </w:r>
-      <w:proofErr w:type="spellEnd"/>
-      <w:r>
-        <w:rPr>
-          <w:rFonts w:cs="Times New Roman"/>
-          <w:sz w:val="28"/>
-          <w:szCs w:val="28"/>
-        </w:rPr>
-        <w:t xml:space="preserve"> </w:t>
-      </w:r>
-      <w:proofErr w:type="spellStart"/>
-      <w:r>
-        <w:rPr>
-          <w:rFonts w:cs="Times New Roman"/>
-          <w:sz w:val="28"/>
-          <w:szCs w:val="28"/>
-        </w:rPr>
-        <w:t>окремі</w:t>
-      </w:r>
-      <w:proofErr w:type="spellEnd"/>
-      <w:r>
-        <w:rPr>
-          <w:rFonts w:cs="Times New Roman"/>
-          <w:sz w:val="28"/>
-          <w:szCs w:val="28"/>
-        </w:rPr>
-        <w:t xml:space="preserve"> сутно</w:t>
-      </w:r>
-      <w:r>
-        <w:rPr>
-          <w:rFonts w:cs="Times New Roman"/>
-          <w:sz w:val="28"/>
-          <w:szCs w:val="28"/>
-        </w:rPr>
-        <w:t xml:space="preserve">сті: об’єкти обліку, лічильники, вимірювання, погодні дані, тарифний розклад, базова лінія та KPI енергоефективності. Для прискорення запитів створено індекси за часом, лічильником, </w:t>
-      </w:r>
-      <w:proofErr w:type="spellStart"/>
-      <w:r>
-        <w:rPr>
-          <w:rFonts w:cs="Times New Roman"/>
-          <w:sz w:val="28"/>
-          <w:szCs w:val="28"/>
-        </w:rPr>
-        <w:t>об’єктом</w:t>
-      </w:r>
-      <w:proofErr w:type="spellEnd"/>
-      <w:r>
-        <w:rPr>
-          <w:rFonts w:cs="Times New Roman"/>
-          <w:sz w:val="28"/>
-          <w:szCs w:val="28"/>
-        </w:rPr>
-        <w:t xml:space="preserve"> і </w:t>
-      </w:r>
-      <w:proofErr w:type="spellStart"/>
-      <w:r>
-        <w:rPr>
-          <w:rFonts w:cs="Times New Roman"/>
-          <w:sz w:val="28"/>
-          <w:szCs w:val="28"/>
-        </w:rPr>
-        <w:t>рівнем</w:t>
-      </w:r>
-      <w:proofErr w:type="spellEnd"/>
-      <w:r>
-        <w:rPr>
-          <w:rFonts w:cs="Times New Roman"/>
-          <w:sz w:val="28"/>
-          <w:szCs w:val="28"/>
-        </w:rPr>
-        <w:t xml:space="preserve"> </w:t>
-      </w:r>
-      <w:proofErr w:type="spellStart"/>
-      <w:r>
-        <w:rPr>
-          <w:rFonts w:cs="Times New Roman"/>
-          <w:sz w:val="28"/>
-          <w:szCs w:val="28"/>
-        </w:rPr>
-        <w:t>обліку</w:t>
-      </w:r>
-      <w:proofErr w:type="spellEnd"/>
-      <w:r>
-        <w:rPr>
-          <w:rFonts w:cs="Times New Roman"/>
-          <w:sz w:val="28"/>
-          <w:szCs w:val="28"/>
-        </w:rPr>
-        <w:t xml:space="preserve">. Для кожного рівня </w:t>
-      </w:r>
-      <w:proofErr w:type="spellStart"/>
-      <w:r>
-        <w:rPr>
-          <w:rFonts w:cs="Times New Roman"/>
-          <w:sz w:val="28"/>
-          <w:szCs w:val="28"/>
-        </w:rPr>
-        <w:t>обліку</w:t>
-      </w:r>
-      <w:proofErr w:type="spellEnd"/>
-      <w:r>
-        <w:rPr>
-          <w:rFonts w:cs="Times New Roman"/>
-          <w:sz w:val="28"/>
-          <w:szCs w:val="28"/>
-        </w:rPr>
-        <w:t xml:space="preserve"> </w:t>
-      </w:r>
-      <w:proofErr w:type="spellStart"/>
-      <w:r>
-        <w:rPr>
-          <w:rFonts w:cs="Times New Roman"/>
-          <w:sz w:val="28"/>
-          <w:szCs w:val="28"/>
-        </w:rPr>
-        <w:t>створено</w:t>
-      </w:r>
-      <w:proofErr w:type="spellEnd"/>
-      <w:r>
-        <w:rPr>
-          <w:rFonts w:cs="Times New Roman"/>
-          <w:sz w:val="28"/>
-          <w:szCs w:val="28"/>
-        </w:rPr>
-        <w:t xml:space="preserve"> </w:t>
-      </w:r>
-      <w:proofErr w:type="spellStart"/>
-      <w:r>
-        <w:rPr>
-          <w:rFonts w:cs="Times New Roman"/>
-          <w:sz w:val="28"/>
-          <w:szCs w:val="28"/>
-        </w:rPr>
-        <w:t>окреме</w:t>
-      </w:r>
-      <w:proofErr w:type="spellEnd"/>
-      <w:r>
-        <w:rPr>
-          <w:rFonts w:cs="Times New Roman"/>
-          <w:sz w:val="28"/>
-          <w:szCs w:val="28"/>
-        </w:rPr>
-        <w:t xml:space="preserve"> SQL-</w:t>
-      </w:r>
-      <w:proofErr w:type="spellStart"/>
-      <w:r>
-        <w:rPr>
-          <w:rFonts w:cs="Times New Roman"/>
-          <w:sz w:val="28"/>
-          <w:szCs w:val="28"/>
-        </w:rPr>
-        <w:t>пре</w:t>
-      </w:r>
-      <w:r>
-        <w:rPr>
-          <w:rFonts w:cs="Times New Roman"/>
-          <w:sz w:val="28"/>
-          <w:szCs w:val="28"/>
-        </w:rPr>
-        <w:t>дставлення</w:t>
-      </w:r>
-      <w:proofErr w:type="spellEnd"/>
-      <w:r>
-        <w:rPr>
-          <w:rFonts w:cs="Times New Roman"/>
-          <w:sz w:val="28"/>
-          <w:szCs w:val="28"/>
-        </w:rPr>
-        <w:t>.</w:t>
+        <w:t>Сховище нормалізовано на окремі сутності: об’єкти обліку, лічильники, вимірювання, погодні дані, тарифний розклад, базова лінія та KPI енергоефективності. Для прискорення запитів створено індекси за часом, лічильником, об’єктом і рівнем обліку. Для кожного рівня обліку створено окреме SQL-представлення.</w:t>
       </w:r>
     </w:p>
     <w:p>
@@ -1768,52 +1197,14 @@
           <w:sz w:val="28"/>
         </w:rPr>
       </w:pPr>
-      <w:proofErr w:type="spellStart"/>
       <w:r>
         <w:rPr>
           <w:rFonts w:ascii="Times New Roman" w:hAnsi="Times New Roman" w:cs="Times New Roman"/>
           <w:color w:val="000000" w:themeColor="text1"/>
           <w:sz w:val="28"/>
         </w:rPr>
-        <w:t>Генерація</w:t>
+        <w:t>Генерація тестових даних</w:t>
       </w:r>
-      <w:proofErr w:type="spellEnd"/>
-      <w:r>
-        <w:rPr>
-          <w:rFonts w:ascii="Times New Roman" w:hAnsi="Times New Roman" w:cs="Times New Roman"/>
-          <w:color w:val="000000" w:themeColor="text1"/>
-          <w:sz w:val="28"/>
-        </w:rPr>
-        <w:t xml:space="preserve"> </w:t>
-      </w:r>
-      <w:proofErr w:type="spellStart"/>
-      <w:r>
-        <w:rPr>
-          <w:rFonts w:ascii="Times New Roman" w:hAnsi="Times New Roman" w:cs="Times New Roman"/>
-          <w:color w:val="000000" w:themeColor="text1"/>
-          <w:sz w:val="28"/>
-        </w:rPr>
-        <w:t>тестових</w:t>
-      </w:r>
-      <w:proofErr w:type="spellEnd"/>
-      <w:r>
-        <w:rPr>
-          <w:rFonts w:ascii="Times New Roman" w:hAnsi="Times New Roman" w:cs="Times New Roman"/>
-          <w:color w:val="000000" w:themeColor="text1"/>
-          <w:sz w:val="28"/>
-        </w:rPr>
-        <w:t xml:space="preserve"> </w:t>
-      </w:r>
-      <w:proofErr w:type="spellStart"/>
-      <w:r>
-        <w:rPr>
-          <w:rFonts w:ascii="Times New Roman" w:hAnsi="Times New Roman" w:cs="Times New Roman"/>
-          <w:color w:val="000000" w:themeColor="text1"/>
-          <w:sz w:val="28"/>
-        </w:rPr>
-        <w:t>даних</w:t>
-      </w:r>
-      <w:proofErr w:type="spellEnd"/>
     </w:p>
     <w:p>
       <w:pPr>
@@ -1832,15 +1223,7 @@
           <w:sz w:val="28"/>
           <w:szCs w:val="28"/>
         </w:rPr>
-        <w:t>Генератор формує погодинні дані за весь 2025 рік. Для головного лічильника створено профіль із добовими, тижневими та сезонними коливаннями, впливом температури, робочим графіко</w:t>
-      </w:r>
-      <w:r>
-        <w:rPr>
-          <w:rFonts w:cs="Times New Roman"/>
-          <w:sz w:val="28"/>
-          <w:szCs w:val="28"/>
-        </w:rPr>
-        <w:t>м 06:00–22:00 та випадковими флуктуаціями ±5–10%. Для підлічильників дані отримуються шляхом реалістичного розподілу основного навантаження за підсистемами лабораторії.</w:t>
+        <w:t>Генератор формує погодинні дані за весь 2025 рік. Для головного лічильника створено профіль із добовими, тижневими та сезонними коливаннями, впливом температури, робочим графіком 06:00–22:00 та випадковими флуктуаціями ±5–10%. Для підлічильників дані отримуються шляхом реалістичного розподілу основного навантаження за підсистемами лабораторії.</w:t>
       </w:r>
     </w:p>
     <w:p>
@@ -1874,7 +1257,6 @@
           <w:sz w:val="28"/>
         </w:rPr>
       </w:pPr>
-      <w:proofErr w:type="spellStart"/>
       <w:r>
         <w:rPr>
           <w:rFonts w:ascii="Times New Roman" w:hAnsi="Times New Roman" w:cs="Times New Roman"/>
@@ -1882,295 +1264,7 @@
           <w:sz w:val="28"/>
         </w:rPr>
         <w:lastRenderedPageBreak/>
-        <w:t>Результати</w:t>
-      </w:r>
-      <w:proofErr w:type="spellEnd"/>
-      <w:r>
-        <w:rPr>
-          <w:rFonts w:ascii="Times New Roman" w:hAnsi="Times New Roman" w:cs="Times New Roman"/>
-          <w:color w:val="000000" w:themeColor="text1"/>
-          <w:sz w:val="28"/>
-        </w:rPr>
-        <w:t xml:space="preserve"> </w:t>
-      </w:r>
-      <w:proofErr w:type="spellStart"/>
-      <w:r>
-        <w:rPr>
-          <w:rFonts w:ascii="Times New Roman" w:hAnsi="Times New Roman" w:cs="Times New Roman"/>
-          <w:color w:val="000000" w:themeColor="text1"/>
-          <w:sz w:val="28"/>
-        </w:rPr>
-        <w:t>ан</w:t>
-      </w:r>
-      <w:r>
-        <w:rPr>
-          <w:rFonts w:ascii="Times New Roman" w:hAnsi="Times New Roman" w:cs="Times New Roman"/>
-          <w:color w:val="000000" w:themeColor="text1"/>
-          <w:sz w:val="28"/>
-        </w:rPr>
-        <w:t>алітичних</w:t>
-      </w:r>
-      <w:proofErr w:type="spellEnd"/>
-      <w:r>
-        <w:rPr>
-          <w:rFonts w:ascii="Times New Roman" w:hAnsi="Times New Roman" w:cs="Times New Roman"/>
-          <w:color w:val="000000" w:themeColor="text1"/>
-          <w:sz w:val="28"/>
-        </w:rPr>
-        <w:t xml:space="preserve"> </w:t>
-      </w:r>
-      <w:proofErr w:type="spellStart"/>
-      <w:r>
-        <w:rPr>
-          <w:rFonts w:ascii="Times New Roman" w:hAnsi="Times New Roman" w:cs="Times New Roman"/>
-          <w:color w:val="000000" w:themeColor="text1"/>
-          <w:sz w:val="28"/>
-        </w:rPr>
-        <w:t>запитів</w:t>
-      </w:r>
-      <w:proofErr w:type="spellEnd"/>
-    </w:p>
-    <w:p>
-      <w:pPr>
-        <w:pStyle w:val="ae"/>
-        <w:numPr>
-          <w:ilvl w:val="0"/>
-          <w:numId w:val="12"/>
-        </w:numPr>
-        <w:spacing w:line="360" w:lineRule="auto"/>
-        <w:rPr>
-          <w:rFonts w:cs="Times New Roman"/>
-          <w:sz w:val="28"/>
-          <w:szCs w:val="28"/>
-        </w:rPr>
-      </w:pPr>
-      <w:proofErr w:type="spellStart"/>
-      <w:r>
-        <w:rPr>
-          <w:rFonts w:cs="Times New Roman"/>
-          <w:sz w:val="28"/>
-          <w:szCs w:val="28"/>
-        </w:rPr>
-        <w:t>Річне</w:t>
-      </w:r>
-      <w:proofErr w:type="spellEnd"/>
-      <w:r>
-        <w:rPr>
-          <w:rFonts w:cs="Times New Roman"/>
-          <w:sz w:val="28"/>
-          <w:szCs w:val="28"/>
-        </w:rPr>
-        <w:t xml:space="preserve"> споживання головного</w:t>
-      </w:r>
-      <w:r>
-        <w:rPr>
-          <w:rFonts w:cs="Times New Roman"/>
-          <w:sz w:val="28"/>
-          <w:szCs w:val="28"/>
-        </w:rPr>
-        <w:t xml:space="preserve"> </w:t>
-      </w:r>
-      <w:proofErr w:type="spellStart"/>
-      <w:r>
-        <w:rPr>
-          <w:rFonts w:cs="Times New Roman"/>
-          <w:sz w:val="28"/>
-          <w:szCs w:val="28"/>
-        </w:rPr>
-        <w:t>лічильника</w:t>
-      </w:r>
-      <w:proofErr w:type="spellEnd"/>
-      <w:r>
-        <w:rPr>
-          <w:rFonts w:cs="Times New Roman"/>
-          <w:sz w:val="28"/>
-          <w:szCs w:val="28"/>
-        </w:rPr>
-        <w:t xml:space="preserve">: 353 956.45 </w:t>
-      </w:r>
-      <w:proofErr w:type="spellStart"/>
-      <w:r>
-        <w:rPr>
-          <w:rFonts w:cs="Times New Roman"/>
-          <w:sz w:val="28"/>
-          <w:szCs w:val="28"/>
-        </w:rPr>
-        <w:t>кВт·год</w:t>
-      </w:r>
-      <w:proofErr w:type="spellEnd"/>
-    </w:p>
-    <w:p>
-      <w:pPr>
-        <w:pStyle w:val="ae"/>
-        <w:numPr>
-          <w:ilvl w:val="0"/>
-          <w:numId w:val="12"/>
-        </w:numPr>
-        <w:spacing w:line="360" w:lineRule="auto"/>
-        <w:rPr>
-          <w:rFonts w:cs="Times New Roman"/>
-          <w:sz w:val="28"/>
-          <w:szCs w:val="28"/>
-        </w:rPr>
-      </w:pPr>
-      <w:proofErr w:type="spellStart"/>
-      <w:r>
-        <w:rPr>
-          <w:rFonts w:cs="Times New Roman"/>
-          <w:sz w:val="28"/>
-          <w:szCs w:val="28"/>
-        </w:rPr>
-        <w:t>Орієнтовна</w:t>
-      </w:r>
-      <w:proofErr w:type="spellEnd"/>
-      <w:r>
-        <w:rPr>
-          <w:rFonts w:cs="Times New Roman"/>
-          <w:sz w:val="28"/>
-          <w:szCs w:val="28"/>
-        </w:rPr>
-        <w:t xml:space="preserve"> </w:t>
-      </w:r>
-      <w:proofErr w:type="spellStart"/>
-      <w:r>
-        <w:rPr>
-          <w:rFonts w:cs="Times New Roman"/>
-          <w:sz w:val="28"/>
-          <w:szCs w:val="28"/>
-        </w:rPr>
-        <w:t>річна</w:t>
-      </w:r>
-      <w:proofErr w:type="spellEnd"/>
-      <w:r>
-        <w:rPr>
-          <w:rFonts w:cs="Times New Roman"/>
-          <w:sz w:val="28"/>
-          <w:szCs w:val="28"/>
-        </w:rPr>
-        <w:t xml:space="preserve"> </w:t>
-      </w:r>
-      <w:proofErr w:type="spellStart"/>
-      <w:r>
-        <w:rPr>
-          <w:rFonts w:cs="Times New Roman"/>
-          <w:sz w:val="28"/>
-          <w:szCs w:val="28"/>
-        </w:rPr>
-        <w:t>вартість</w:t>
-      </w:r>
-      <w:proofErr w:type="spellEnd"/>
-      <w:r>
-        <w:rPr>
-          <w:rFonts w:cs="Times New Roman"/>
-          <w:sz w:val="28"/>
-          <w:szCs w:val="28"/>
-        </w:rPr>
-        <w:t xml:space="preserve"> </w:t>
-      </w:r>
-      <w:proofErr w:type="spellStart"/>
-      <w:r>
-        <w:rPr>
-          <w:rFonts w:cs="Times New Roman"/>
-          <w:sz w:val="28"/>
-          <w:szCs w:val="28"/>
-        </w:rPr>
-        <w:t>за</w:t>
-      </w:r>
-      <w:proofErr w:type="spellEnd"/>
-      <w:r>
-        <w:rPr>
-          <w:rFonts w:cs="Times New Roman"/>
-          <w:sz w:val="28"/>
-          <w:szCs w:val="28"/>
-        </w:rPr>
-        <w:t xml:space="preserve"> 3-з</w:t>
-      </w:r>
-      <w:r>
-        <w:rPr>
-          <w:rFonts w:cs="Times New Roman"/>
-          <w:sz w:val="28"/>
-          <w:szCs w:val="28"/>
-        </w:rPr>
-        <w:t xml:space="preserve">онним тарифом: 2 589 776.37 </w:t>
-      </w:r>
-      <w:proofErr w:type="spellStart"/>
-      <w:r>
-        <w:rPr>
-          <w:rFonts w:cs="Times New Roman"/>
-          <w:sz w:val="28"/>
-          <w:szCs w:val="28"/>
-        </w:rPr>
-        <w:t>грн</w:t>
-      </w:r>
-      <w:proofErr w:type="spellEnd"/>
-    </w:p>
-    <w:p>
-      <w:pPr>
-        <w:pStyle w:val="ae"/>
-        <w:numPr>
-          <w:ilvl w:val="0"/>
-          <w:numId w:val="12"/>
-        </w:numPr>
-        <w:spacing w:line="360" w:lineRule="auto"/>
-        <w:rPr>
-          <w:rFonts w:cs="Times New Roman"/>
-          <w:sz w:val="28"/>
-          <w:szCs w:val="28"/>
-        </w:rPr>
-      </w:pPr>
-      <w:proofErr w:type="spellStart"/>
-      <w:r>
-        <w:rPr>
-          <w:rFonts w:cs="Times New Roman"/>
-          <w:sz w:val="28"/>
-          <w:szCs w:val="28"/>
-        </w:rPr>
-        <w:t>Питомий</w:t>
-      </w:r>
-      <w:proofErr w:type="spellEnd"/>
-      <w:r>
-        <w:rPr>
-          <w:rFonts w:cs="Times New Roman"/>
-          <w:sz w:val="28"/>
-          <w:szCs w:val="28"/>
-        </w:rPr>
-        <w:t xml:space="preserve"> </w:t>
-      </w:r>
-      <w:proofErr w:type="spellStart"/>
-      <w:r>
-        <w:rPr>
-          <w:rFonts w:cs="Times New Roman"/>
-          <w:sz w:val="28"/>
-          <w:szCs w:val="28"/>
-        </w:rPr>
-        <w:t>показник</w:t>
-      </w:r>
-      <w:proofErr w:type="spellEnd"/>
-      <w:r>
-        <w:rPr>
-          <w:rFonts w:cs="Times New Roman"/>
-          <w:sz w:val="28"/>
-          <w:szCs w:val="28"/>
-        </w:rPr>
-        <w:t xml:space="preserve">: 589.93 </w:t>
-      </w:r>
-      <w:proofErr w:type="spellStart"/>
-      <w:r>
-        <w:rPr>
-          <w:rFonts w:cs="Times New Roman"/>
-          <w:sz w:val="28"/>
-          <w:szCs w:val="28"/>
-        </w:rPr>
-        <w:t>кВт·год</w:t>
-      </w:r>
-      <w:proofErr w:type="spellEnd"/>
-      <w:r>
-        <w:rPr>
-          <w:rFonts w:cs="Times New Roman"/>
-          <w:sz w:val="28"/>
-          <w:szCs w:val="28"/>
-        </w:rPr>
-        <w:t>/м²·рік</w:t>
+        <w:t>Результати аналітичних запитів</w:t>
       </w:r>
     </w:p>
     <w:p>
@@ -2187,77 +1281,106 @@
           <w:szCs w:val="28"/>
         </w:rPr>
       </w:pPr>
-      <w:proofErr w:type="spellStart"/>
       <w:r>
         <w:rPr>
           <w:rFonts w:cs="Times New Roman"/>
           <w:sz w:val="28"/>
           <w:szCs w:val="28"/>
         </w:rPr>
-        <w:t>Кількість</w:t>
+        <w:t>Річне споживання головного</w:t>
       </w:r>
-      <w:proofErr w:type="spellEnd"/>
       <w:r>
         <w:rPr>
           <w:rFonts w:cs="Times New Roman"/>
           <w:sz w:val="28"/>
           <w:szCs w:val="28"/>
         </w:rPr>
-        <w:t xml:space="preserve"> </w:t>
+        <w:t xml:space="preserve"> лічильника: 353 956.45 кВт·год</w:t>
       </w:r>
-      <w:proofErr w:type="spellStart"/>
+    </w:p>
+    <w:p>
+      <w:pPr>
+        <w:pStyle w:val="ae"/>
+        <w:numPr>
+          <w:ilvl w:val="0"/>
+          <w:numId w:val="12"/>
+        </w:numPr>
+        <w:spacing w:line="360" w:lineRule="auto"/>
+        <w:rPr>
+          <w:rFonts w:cs="Times New Roman"/>
+          <w:sz w:val="28"/>
+          <w:szCs w:val="28"/>
+        </w:rPr>
+      </w:pPr>
       <w:r>
         <w:rPr>
           <w:rFonts w:cs="Times New Roman"/>
           <w:sz w:val="28"/>
           <w:szCs w:val="28"/>
         </w:rPr>
-        <w:t>аномальних</w:t>
+        <w:t>Орієнтовна річна вартість за 3-з</w:t>
       </w:r>
-      <w:proofErr w:type="spellEnd"/>
       <w:r>
         <w:rPr>
           <w:rFonts w:cs="Times New Roman"/>
           <w:sz w:val="28"/>
           <w:szCs w:val="28"/>
         </w:rPr>
-        <w:t xml:space="preserve"> </w:t>
+        <w:t>онним тарифом: 2 589 776.37 грн</w:t>
       </w:r>
-      <w:proofErr w:type="spellStart"/>
+    </w:p>
+    <w:p>
+      <w:pPr>
+        <w:pStyle w:val="ae"/>
+        <w:numPr>
+          <w:ilvl w:val="0"/>
+          <w:numId w:val="12"/>
+        </w:numPr>
+        <w:spacing w:line="360" w:lineRule="auto"/>
+        <w:rPr>
+          <w:rFonts w:cs="Times New Roman"/>
+          <w:sz w:val="28"/>
+          <w:szCs w:val="28"/>
+        </w:rPr>
+      </w:pPr>
       <w:r>
         <w:rPr>
           <w:rFonts w:cs="Times New Roman"/>
           <w:sz w:val="28"/>
           <w:szCs w:val="28"/>
         </w:rPr>
-        <w:t>годин</w:t>
+        <w:t xml:space="preserve">Питомий </w:t>
       </w:r>
-      <w:proofErr w:type="spellEnd"/>
       <w:r>
         <w:rPr>
           <w:rFonts w:cs="Times New Roman"/>
           <w:sz w:val="28"/>
           <w:szCs w:val="28"/>
         </w:rPr>
-        <w:t xml:space="preserve"> у </w:t>
+        <w:t>показник: 589.93 кВт·год/м²·рік</w:t>
       </w:r>
-      <w:proofErr w:type="spellStart"/>
+    </w:p>
+    <w:p>
+      <w:pPr>
+        <w:pStyle w:val="ae"/>
+        <w:numPr>
+          <w:ilvl w:val="0"/>
+          <w:numId w:val="12"/>
+        </w:numPr>
+        <w:spacing w:line="360" w:lineRule="auto"/>
+        <w:rPr>
+          <w:rFonts w:cs="Times New Roman"/>
+          <w:sz w:val="28"/>
+          <w:szCs w:val="28"/>
+        </w:rPr>
+      </w:pPr>
       <w:r>
         <w:rPr>
           <w:rFonts w:cs="Times New Roman"/>
           <w:sz w:val="28"/>
           <w:szCs w:val="28"/>
         </w:rPr>
-        <w:t>топ-вибірці</w:t>
-      </w:r>
-      <w:proofErr w:type="spellEnd"/>
-      <w:r>
-        <w:rPr>
-          <w:rFonts w:cs="Times New Roman"/>
-          <w:sz w:val="28"/>
-          <w:szCs w:val="28"/>
-        </w:rPr>
-        <w:t xml:space="preserve"> (&gt;20%)</w:t>
+        <w:t>Кількість аномальних годин у топ-вибірці (&gt;20%)</w:t>
       </w:r>
       <w:r>
         <w:rPr>
@@ -2282,77 +1405,13 @@
           <w:szCs w:val="28"/>
         </w:rPr>
       </w:pPr>
-      <w:proofErr w:type="spellStart"/>
       <w:r>
         <w:rPr>
           <w:rFonts w:cs="Times New Roman"/>
           <w:sz w:val="28"/>
           <w:szCs w:val="28"/>
         </w:rPr>
-        <w:t>Найбільша</w:t>
-      </w:r>
-      <w:proofErr w:type="spellEnd"/>
-      <w:r>
-        <w:rPr>
-          <w:rFonts w:cs="Times New Roman"/>
-          <w:sz w:val="28"/>
-          <w:szCs w:val="28"/>
-        </w:rPr>
-        <w:t xml:space="preserve"> тарифна </w:t>
-      </w:r>
-      <w:proofErr w:type="spellStart"/>
-      <w:r>
-        <w:rPr>
-          <w:rFonts w:cs="Times New Roman"/>
-          <w:sz w:val="28"/>
-          <w:szCs w:val="28"/>
-        </w:rPr>
-        <w:t>складова</w:t>
-      </w:r>
-      <w:proofErr w:type="spellEnd"/>
-      <w:r>
-        <w:rPr>
-          <w:rFonts w:cs="Times New Roman"/>
-          <w:sz w:val="28"/>
-          <w:szCs w:val="28"/>
-        </w:rPr>
-        <w:t xml:space="preserve"> </w:t>
-      </w:r>
-      <w:proofErr w:type="spellStart"/>
-      <w:r>
-        <w:rPr>
-          <w:rFonts w:cs="Times New Roman"/>
-          <w:sz w:val="28"/>
-          <w:szCs w:val="28"/>
-        </w:rPr>
-        <w:t>за</w:t>
-      </w:r>
-      <w:proofErr w:type="spellEnd"/>
-      <w:r>
-        <w:rPr>
-          <w:rFonts w:cs="Times New Roman"/>
-          <w:sz w:val="28"/>
-          <w:szCs w:val="28"/>
-        </w:rPr>
-        <w:t xml:space="preserve"> </w:t>
-      </w:r>
-      <w:proofErr w:type="spellStart"/>
-      <w:r>
-        <w:rPr>
-          <w:rFonts w:cs="Times New Roman"/>
-          <w:sz w:val="28"/>
-          <w:szCs w:val="28"/>
-        </w:rPr>
-        <w:t>вартістю</w:t>
-      </w:r>
-      <w:proofErr w:type="spellEnd"/>
-      <w:r>
-        <w:rPr>
-          <w:rFonts w:cs="Times New Roman"/>
-          <w:sz w:val="28"/>
-          <w:szCs w:val="28"/>
-        </w:rPr>
-        <w:t>: peak</w:t>
+        <w:t>Найбільша тарифна складова за вартістю: peak</w:t>
       </w:r>
     </w:p>
     <w:p>
@@ -2375,79 +1434,8 @@
           <w:sz w:val="28"/>
           <w:szCs w:val="28"/>
         </w:rPr>
-        <w:t xml:space="preserve">Таблиця 1 — </w:t>
+        <w:t>Таблиця 1 — Місячне споживання головного лічильника</w:t>
       </w:r>
-      <w:proofErr w:type="spellStart"/>
-      <w:r>
-        <w:rPr>
-          <w:rFonts w:ascii="Times New Roman" w:hAnsi="Times New Roman" w:cs="Times New Roman"/>
-          <w:color w:val="000000" w:themeColor="text1"/>
-          <w:sz w:val="28"/>
-          <w:szCs w:val="28"/>
-        </w:rPr>
-        <w:t>Місячне</w:t>
-      </w:r>
-      <w:proofErr w:type="spellEnd"/>
-      <w:r>
-        <w:rPr>
-          <w:rFonts w:ascii="Times New Roman" w:hAnsi="Times New Roman" w:cs="Times New Roman"/>
-          <w:color w:val="000000" w:themeColor="text1"/>
-          <w:sz w:val="28"/>
-          <w:szCs w:val="28"/>
-        </w:rPr>
-        <w:t xml:space="preserve"> </w:t>
-      </w:r>
-      <w:proofErr w:type="spellStart"/>
-      <w:r>
-        <w:rPr>
-          <w:rFonts w:ascii="Times New Roman" w:hAnsi="Times New Roman" w:cs="Times New Roman"/>
-          <w:color w:val="000000" w:themeColor="text1"/>
-          <w:sz w:val="28"/>
-          <w:szCs w:val="28"/>
-        </w:rPr>
-        <w:t>споживання</w:t>
-      </w:r>
-      <w:proofErr w:type="spellEnd"/>
-      <w:r>
-        <w:rPr>
-          <w:rFonts w:ascii="Times New Roman" w:hAnsi="Times New Roman" w:cs="Times New Roman"/>
-          <w:color w:val="000000" w:themeColor="text1"/>
-          <w:sz w:val="28"/>
-          <w:szCs w:val="28"/>
-        </w:rPr>
-        <w:t xml:space="preserve"> </w:t>
-      </w:r>
-      <w:proofErr w:type="spellStart"/>
-      <w:r>
-        <w:rPr>
-          <w:rFonts w:ascii="Times New Roman" w:hAnsi="Times New Roman" w:cs="Times New Roman"/>
-          <w:color w:val="000000" w:themeColor="text1"/>
-          <w:sz w:val="28"/>
-          <w:szCs w:val="28"/>
-        </w:rPr>
-        <w:t>головного</w:t>
-      </w:r>
-      <w:proofErr w:type="spellEnd"/>
-      <w:r>
-        <w:rPr>
-          <w:rFonts w:ascii="Times New Roman" w:hAnsi="Times New Roman" w:cs="Times New Roman"/>
-          <w:color w:val="000000" w:themeColor="text1"/>
-          <w:sz w:val="28"/>
-          <w:szCs w:val="28"/>
-        </w:rPr>
-        <w:t xml:space="preserve"> </w:t>
-      </w:r>
-      <w:proofErr w:type="spellStart"/>
-      <w:r>
-        <w:rPr>
-          <w:rFonts w:ascii="Times New Roman" w:hAnsi="Times New Roman" w:cs="Times New Roman"/>
-          <w:color w:val="000000" w:themeColor="text1"/>
-          <w:sz w:val="28"/>
-          <w:szCs w:val="28"/>
-        </w:rPr>
-        <w:t>лічильника</w:t>
-      </w:r>
-      <w:proofErr w:type="spellEnd"/>
     </w:p>
     <w:tbl>
       <w:tblPr>
@@ -3184,79 +2172,8 @@
           <w:szCs w:val="28"/>
         </w:rPr>
         <w:lastRenderedPageBreak/>
-        <w:t xml:space="preserve">Таблиця 2 — Споживання і </w:t>
+        <w:t>Таблиця 2 — Споживання і вартість за тарифними зонами</w:t>
       </w:r>
-      <w:proofErr w:type="spellStart"/>
-      <w:r>
-        <w:rPr>
-          <w:rFonts w:ascii="Times New Roman" w:hAnsi="Times New Roman" w:cs="Times New Roman"/>
-          <w:color w:val="000000" w:themeColor="text1"/>
-          <w:sz w:val="28"/>
-          <w:szCs w:val="28"/>
-        </w:rPr>
-        <w:t>вартість</w:t>
-      </w:r>
-      <w:proofErr w:type="spellEnd"/>
-      <w:r>
-        <w:rPr>
-          <w:rFonts w:ascii="Times New Roman" w:hAnsi="Times New Roman" w:cs="Times New Roman"/>
-          <w:color w:val="000000" w:themeColor="text1"/>
-          <w:sz w:val="28"/>
-          <w:szCs w:val="28"/>
-        </w:rPr>
-        <w:t xml:space="preserve"> </w:t>
-      </w:r>
-      <w:proofErr w:type="spellStart"/>
-      <w:r>
-        <w:rPr>
-          <w:rFonts w:ascii="Times New Roman" w:hAnsi="Times New Roman" w:cs="Times New Roman"/>
-          <w:color w:val="000000" w:themeColor="text1"/>
-          <w:sz w:val="28"/>
-          <w:szCs w:val="28"/>
-        </w:rPr>
-        <w:t>за</w:t>
-      </w:r>
-      <w:proofErr w:type="spellEnd"/>
-      <w:r>
-        <w:rPr>
-          <w:rFonts w:ascii="Times New Roman" w:hAnsi="Times New Roman" w:cs="Times New Roman"/>
-          <w:color w:val="000000" w:themeColor="text1"/>
-          <w:sz w:val="28"/>
-          <w:szCs w:val="28"/>
-        </w:rPr>
-        <w:t xml:space="preserve"> </w:t>
-      </w:r>
-      <w:proofErr w:type="spellStart"/>
-      <w:r>
-        <w:rPr>
-          <w:rFonts w:ascii="Times New Roman" w:hAnsi="Times New Roman" w:cs="Times New Roman"/>
-          <w:color w:val="000000" w:themeColor="text1"/>
-          <w:sz w:val="28"/>
-          <w:szCs w:val="28"/>
-        </w:rPr>
-        <w:t>тарифними</w:t>
-      </w:r>
-      <w:proofErr w:type="spellEnd"/>
-      <w:r>
-        <w:rPr>
-          <w:rFonts w:ascii="Times New Roman" w:hAnsi="Times New Roman" w:cs="Times New Roman"/>
-          <w:color w:val="000000" w:themeColor="text1"/>
-          <w:sz w:val="28"/>
-          <w:szCs w:val="28"/>
-        </w:rPr>
-        <w:t xml:space="preserve"> </w:t>
-      </w:r>
-      <w:proofErr w:type="spellStart"/>
-      <w:r>
-        <w:rPr>
-          <w:rFonts w:ascii="Times New Roman" w:hAnsi="Times New Roman" w:cs="Times New Roman"/>
-          <w:color w:val="000000" w:themeColor="text1"/>
-          <w:sz w:val="28"/>
-          <w:szCs w:val="28"/>
-        </w:rPr>
-        <w:t>зонами</w:t>
-      </w:r>
-      <w:proofErr w:type="spellEnd"/>
     </w:p>
     <w:tbl>
       <w:tblPr>
@@ -3595,7 +2512,6 @@
           <w:szCs w:val="28"/>
         </w:rPr>
       </w:pPr>
-      <w:proofErr w:type="spellStart"/>
       <w:r>
         <w:rPr>
           <w:rFonts w:ascii="Times New Roman" w:hAnsi="Times New Roman" w:cs="Times New Roman"/>
@@ -3603,77 +2519,7 @@
           <w:sz w:val="28"/>
           <w:szCs w:val="28"/>
         </w:rPr>
-        <w:t>Таблиця</w:t>
-      </w:r>
-      <w:proofErr w:type="spellEnd"/>
-      <w:r>
-        <w:rPr>
-          <w:rFonts w:ascii="Times New Roman" w:hAnsi="Times New Roman" w:cs="Times New Roman"/>
-          <w:color w:val="000000" w:themeColor="text1"/>
-          <w:sz w:val="28"/>
-          <w:szCs w:val="28"/>
-        </w:rPr>
-        <w:t xml:space="preserve"> 3 — </w:t>
-      </w:r>
-      <w:proofErr w:type="spellStart"/>
-      <w:r>
-        <w:rPr>
-          <w:rFonts w:ascii="Times New Roman" w:hAnsi="Times New Roman" w:cs="Times New Roman"/>
-          <w:color w:val="000000" w:themeColor="text1"/>
-          <w:sz w:val="28"/>
-          <w:szCs w:val="28"/>
-        </w:rPr>
-        <w:t>Питомі</w:t>
-      </w:r>
-      <w:proofErr w:type="spellEnd"/>
-      <w:r>
-        <w:rPr>
-          <w:rFonts w:ascii="Times New Roman" w:hAnsi="Times New Roman" w:cs="Times New Roman"/>
-          <w:color w:val="000000" w:themeColor="text1"/>
-          <w:sz w:val="28"/>
-          <w:szCs w:val="28"/>
-        </w:rPr>
-        <w:t xml:space="preserve"> </w:t>
-      </w:r>
-      <w:proofErr w:type="spellStart"/>
-      <w:r>
-        <w:rPr>
-          <w:rFonts w:ascii="Times New Roman" w:hAnsi="Times New Roman" w:cs="Times New Roman"/>
-          <w:color w:val="000000" w:themeColor="text1"/>
-          <w:sz w:val="28"/>
-          <w:szCs w:val="28"/>
-        </w:rPr>
-        <w:t>показники</w:t>
-      </w:r>
-      <w:proofErr w:type="spellEnd"/>
-      <w:r>
-        <w:rPr>
-          <w:rFonts w:ascii="Times New Roman" w:hAnsi="Times New Roman" w:cs="Times New Roman"/>
-          <w:color w:val="000000" w:themeColor="text1"/>
-          <w:sz w:val="28"/>
-          <w:szCs w:val="28"/>
-        </w:rPr>
-        <w:t xml:space="preserve"> </w:t>
-      </w:r>
-      <w:proofErr w:type="spellStart"/>
-      <w:r>
-        <w:rPr>
-          <w:rFonts w:ascii="Times New Roman" w:hAnsi="Times New Roman" w:cs="Times New Roman"/>
-          <w:color w:val="000000" w:themeColor="text1"/>
-          <w:sz w:val="28"/>
-          <w:szCs w:val="28"/>
-        </w:rPr>
-        <w:t>та</w:t>
-      </w:r>
-      <w:proofErr w:type="spellEnd"/>
-      <w:r>
-        <w:rPr>
-          <w:rFonts w:ascii="Times New Roman" w:hAnsi="Times New Roman" w:cs="Times New Roman"/>
-          <w:color w:val="000000" w:themeColor="text1"/>
-          <w:sz w:val="28"/>
-          <w:szCs w:val="28"/>
-        </w:rPr>
-        <w:t xml:space="preserve"> baseline</w:t>
+        <w:t>Таблиця 3 — Питомі показники та baseline</w:t>
       </w:r>
     </w:p>
     <w:tbl>
@@ -5667,67 +4513,7 @@
           <w:szCs w:val="28"/>
         </w:rPr>
         <w:lastRenderedPageBreak/>
-        <w:t xml:space="preserve">Таблиця 4 — </w:t>
-      </w:r>
-      <w:proofErr w:type="spellStart"/>
-      <w:r>
-        <w:rPr>
-          <w:rFonts w:ascii="Times New Roman" w:hAnsi="Times New Roman" w:cs="Times New Roman"/>
-          <w:color w:val="000000" w:themeColor="text1"/>
-          <w:sz w:val="28"/>
-          <w:szCs w:val="28"/>
-        </w:rPr>
-        <w:t>Приклади</w:t>
-      </w:r>
-      <w:proofErr w:type="spellEnd"/>
-      <w:r>
-        <w:rPr>
-          <w:rFonts w:ascii="Times New Roman" w:hAnsi="Times New Roman" w:cs="Times New Roman"/>
-          <w:color w:val="000000" w:themeColor="text1"/>
-          <w:sz w:val="28"/>
-          <w:szCs w:val="28"/>
-        </w:rPr>
-        <w:t xml:space="preserve"> </w:t>
-      </w:r>
-      <w:proofErr w:type="spellStart"/>
-      <w:r>
-        <w:rPr>
-          <w:rFonts w:ascii="Times New Roman" w:hAnsi="Times New Roman" w:cs="Times New Roman"/>
-          <w:color w:val="000000" w:themeColor="text1"/>
-          <w:sz w:val="28"/>
-          <w:szCs w:val="28"/>
-        </w:rPr>
-        <w:t>аномалій</w:t>
-      </w:r>
-      <w:proofErr w:type="spellEnd"/>
-      <w:r>
-        <w:rPr>
-          <w:rFonts w:ascii="Times New Roman" w:hAnsi="Times New Roman" w:cs="Times New Roman"/>
-          <w:color w:val="000000" w:themeColor="text1"/>
-          <w:sz w:val="28"/>
-          <w:szCs w:val="28"/>
-        </w:rPr>
-        <w:t xml:space="preserve"> </w:t>
-      </w:r>
-      <w:proofErr w:type="spellStart"/>
-      <w:r>
-        <w:rPr>
-          <w:rFonts w:ascii="Times New Roman" w:hAnsi="Times New Roman" w:cs="Times New Roman"/>
-          <w:color w:val="000000" w:themeColor="text1"/>
-          <w:sz w:val="28"/>
-          <w:szCs w:val="28"/>
-        </w:rPr>
-        <w:t>понад</w:t>
-      </w:r>
-      <w:proofErr w:type="spellEnd"/>
-      <w:r>
-        <w:rPr>
-          <w:rFonts w:ascii="Times New Roman" w:hAnsi="Times New Roman" w:cs="Times New Roman"/>
-          <w:color w:val="000000" w:themeColor="text1"/>
-          <w:sz w:val="28"/>
-          <w:szCs w:val="28"/>
-        </w:rPr>
-        <w:t xml:space="preserve"> 20%</w:t>
+        <w:t>Таблиця 4 — Приклади аномалій понад 20%</w:t>
       </w:r>
     </w:p>
     <w:tbl>
@@ -6881,7 +5667,6 @@
           <w:sz w:val="28"/>
         </w:rPr>
       </w:pPr>
-      <w:proofErr w:type="spellStart"/>
       <w:r>
         <w:rPr>
           <w:rFonts w:ascii="Times New Roman" w:hAnsi="Times New Roman" w:cs="Times New Roman"/>
@@ -6889,43 +5674,6 @@
           <w:sz w:val="28"/>
         </w:rPr>
         <w:t>Висновки</w:t>
-      </w:r>
-      <w:proofErr w:type="spellEnd"/>
-    </w:p>
-    <w:p>
-      <w:pPr>
-        <w:spacing w:after="120" w:line="360" w:lineRule="auto"/>
-        <w:ind w:firstLine="567"/>
-        <w:jc w:val="both"/>
-        <w:rPr>
-          <w:rFonts w:cs="Times New Roman"/>
-          <w:sz w:val="28"/>
-          <w:szCs w:val="28"/>
-        </w:rPr>
-      </w:pPr>
-      <w:r>
-        <w:rPr>
-          <w:rFonts w:cs="Times New Roman"/>
-          <w:sz w:val="28"/>
-          <w:szCs w:val="28"/>
-        </w:rPr>
-        <w:t xml:space="preserve">У ході виконання лабораторної роботи було спроєктовано та реалізовано реляційне сховище даних для системи енергетичного моніторингу лабораторії за варіантом 3. Створена база даних враховує основні вимоги до трирівневого </w:t>
-      </w:r>
-      <w:r>
-        <w:rPr>
-          <w:rFonts w:cs="Times New Roman"/>
-          <w:sz w:val="28"/>
-          <w:szCs w:val="28"/>
-        </w:rPr>
-        <w:t>обліку: збереження інформації про об’єкт, лічильники різних рівнів, погодинні вимірювання, метеорологічні показники, тарифні зони, базову лінію споживання та показники енергоефективності. Така структура дозволяє не лише накопичувати дані, а й виконувати по</w:t>
-      </w:r>
-      <w:r>
-        <w:rPr>
-          <w:rFonts w:cs="Times New Roman"/>
-          <w:sz w:val="28"/>
-          <w:szCs w:val="28"/>
-        </w:rPr>
-        <w:t>дальший аналіз енергоспоживання за різними періодами, рівнями обліку та тарифними зонами.</w:t>
       </w:r>
     </w:p>
     <w:p>
@@ -6945,23 +5693,7 @@
           <w:sz w:val="28"/>
           <w:szCs w:val="28"/>
         </w:rPr>
-        <w:t>Для реалізації сховища було використано SQLite, що є зручним рішенням для навчального проєкту, оскільки база зберігається в одному файлі, не потребує окремого серверн</w:t>
-      </w:r>
-      <w:r>
-        <w:rPr>
-          <w:rFonts w:cs="Times New Roman"/>
-          <w:sz w:val="28"/>
-          <w:szCs w:val="28"/>
-        </w:rPr>
-        <w:t>ого налаштування та може бути швидко перевірена на будь-якому комп’ютері з Python. У структурі бази передбачено зв’язки між таблицями, первинні та зовнішні ключі, а також індекси для пришвидшення запитів за часом, лічильниками та рівнями обліку. Це забезпе</w:t>
-      </w:r>
-      <w:r>
-        <w:rPr>
-          <w:rFonts w:cs="Times New Roman"/>
-          <w:sz w:val="28"/>
-          <w:szCs w:val="28"/>
-        </w:rPr>
-        <w:t>чує цілісність даних і створює основу для розширення системи у наступних лабораторних роботах.</w:t>
+        <w:t>У ході виконання лабораторної роботи було спроєктовано та реалізовано реляційне сховище даних для системи енергетичного моніторингу лабораторії за варіантом 3. Створена база даних враховує основні вимоги до трирівневого обліку: збереження інформації про об’єкт, лічильники різних рівнів, погодинні вимірювання, метеорологічні показники, тарифні зони, базову лінію споживання та показники енергоефективності. Така структура дозволяє не лише накопичувати дані, а й виконувати подальший аналіз енергоспоживання за різними періодами, рівнями обліку та тарифними зонами.</w:t>
       </w:r>
     </w:p>
     <w:p>
@@ -6981,23 +5713,27 @@
           <w:sz w:val="28"/>
           <w:szCs w:val="28"/>
         </w:rPr>
-        <w:t>Окрему увагу було приділено генерації тестових даних. Для лабораторії сформовано погодинний набір вимірювань за весь 2025 рік: 8760 годин для кожного з 7 лічильн</w:t>
+        <w:t>Для реалізації сховища було використано SQLite, що є зручним рішенням для навчального проєкту, оскільки база зберігається в одному файлі, не потребує окремого серверного налаштування та може бути швидко перевірена на будь-якому комп’ютері з Python. У структурі бази передбачено зв’язки між таблицями, первинні та зовнішні ключі, а також індекси для пришвидшення запитів за часом, лічильниками та рівнями обліку. Це забезпечує цілісність даних і створює основу для розширення системи у наступних лабораторних роботах.</w:t>
       </w:r>
+    </w:p>
+    <w:p>
+      <w:pPr>
+        <w:spacing w:after="120" w:line="360" w:lineRule="auto"/>
+        <w:ind w:firstLine="567"/>
+        <w:jc w:val="both"/>
+        <w:rPr>
+          <w:rFonts w:cs="Times New Roman"/>
+          <w:sz w:val="28"/>
+          <w:szCs w:val="28"/>
+        </w:rPr>
+      </w:pPr>
       <w:r>
         <w:rPr>
           <w:rFonts w:cs="Times New Roman"/>
           <w:sz w:val="28"/>
           <w:szCs w:val="28"/>
         </w:rPr>
-        <w:t xml:space="preserve">иків, тобто 61 320 записів у таблиці вимірювань. Профіль споживання враховує режим роботи об’єкта 06:00–22:00, сезонні зміни, різницю між робочими та вихідними днями, вплив температури, випадкові коливання та особливості трирівневого обліку. Завдяки цьому </w:t>
-      </w:r>
-      <w:r>
-        <w:rPr>
-          <w:rFonts w:cs="Times New Roman"/>
-          <w:sz w:val="28"/>
-          <w:szCs w:val="28"/>
-        </w:rPr>
-        <w:t>тестові дані є достатньо реалістичними для виконання аналітичних розрахунків.</w:t>
+        <w:t>Окрему увагу було приділено генерації тестових даних. Для лабораторії сформовано погодинний набір вимірювань за весь 2025 рік: 8760 годин для кожного з 7 лічильників, тобто 61 320 записів у таблиці вимірювань. Профіль споживання враховує режим роботи об’єкта 06:00–22:00, сезонні зміни, різницю між робочими та вихідними днями, вплив температури, випадкові коливання та особливості трирівневого обліку. Завдяки цьому тестові дані є достатньо реалістичними для виконання аналітичних розрахунків.</w:t>
       </w:r>
     </w:p>
     <w:p>
@@ -7018,7 +5754,7 @@
           <w:szCs w:val="28"/>
         </w:rPr>
         <w:lastRenderedPageBreak/>
-        <w:t>У межах аналітичної частини було сформовано запити та результати для добового, тижневого й місячного споживання, розрахунку витрат за тарифними зонами, питомих показників у кВт·г</w:t>
+        <w:t>У межах аналітичної частини було сформовано запити та результати для добового, тижневого й місячного споживання, розрахунку витрат за тарифними зонами, питомих показників у кВт·год/м², порівняння з базовою лінією та виявлення аномальних значень. За результатами розрахунків річне споживання головного лічильника становить 353 956,45 кВт·год, а орієнтовна річна вартість елек</w:t>
       </w:r>
       <w:r>
         <w:rPr>
@@ -7026,15 +5762,17 @@
           <w:sz w:val="28"/>
           <w:szCs w:val="28"/>
         </w:rPr>
-        <w:t>од/м², порівняння з базовою лінією та виявлення аномальних значень. За результатами розрахунків річне споживання головного лічильника становить 353 956,45 кВт·год, а орієнтовна річна вартість електроенергії за 3-зонним тарифом — 2 589 776,37 грн. Питомий п</w:t>
+        <w:t xml:space="preserve">троенергії за 3-зонним тарифом </w:t>
       </w:r>
+      <w:bookmarkStart w:id="0" w:name="_GoBack"/>
+      <w:bookmarkEnd w:id="0"/>
       <w:r>
         <w:rPr>
           <w:rFonts w:cs="Times New Roman"/>
           <w:sz w:val="28"/>
           <w:szCs w:val="28"/>
         </w:rPr>
-        <w:t>оказник споживання становить 589,93 кВт·год/м²·рік, що дає можливість оцінювати ефективність використання енергії для об’єкта заданої площі.</w:t>
+        <w:t xml:space="preserve"> 2 589 776,37 грн. Питомий показник споживання становить 589,93 кВт·год/м²·рік, що дає можливість оцінювати ефективність використання енергії для об’єкта заданої площі.</w:t>
       </w:r>
     </w:p>
     <w:p>
@@ -7054,23 +5792,7 @@
           <w:sz w:val="28"/>
           <w:szCs w:val="28"/>
         </w:rPr>
-        <w:t>Практична перевірка роботи підтвердила коректність реалізації. Під час запуску скрипта генерації було створено файл</w:t>
-      </w:r>
-      <w:r>
-        <w:rPr>
-          <w:rFonts w:cs="Times New Roman"/>
-          <w:sz w:val="28"/>
-          <w:szCs w:val="28"/>
-        </w:rPr>
-        <w:t xml:space="preserve"> бази даних outputs/energy_lab1_v3.sqlite, а вивід у терміналі підтвердив наявність 61 320 погодинних записів. Додатково перевірено кількість об’єктів, лічильників, метеоданих, тарифних зон, записів базової лінії та роботу представлень v_level1_hourly, v_l</w:t>
-      </w:r>
-      <w:r>
-        <w:rPr>
-          <w:rFonts w:cs="Times New Roman"/>
-          <w:sz w:val="28"/>
-          <w:szCs w:val="28"/>
-        </w:rPr>
-        <w:t>evel2_hourly і v_level3_hourly. Також сформовано CSV-файли з аналітичними результатами та діаграму логічної структури бази даних, що наведено у додатку до звіту.</w:t>
+        <w:t>Практична перевірка роботи підтвердила коректність реалізації. Під час запуску скрипта генерації було створено файл бази даних outputs/energy_lab1_v3.sqlite, а вивід у терміналі підтвердив наявність 61 320 погодинних записів. Додатково перевірено кількість об’єктів, лічильників, метеоданих, тарифних зон, записів базової лінії та роботу представлень v_level1_hourly, v_level2_hourly і v_level3_hourly. Також сформовано CSV-файли з аналітичними результатами та діаграму логічної структури бази даних, що наведено у додатку до звіту.</w:t>
       </w:r>
     </w:p>
     <w:p>
@@ -7090,23 +5812,7 @@
           <w:sz w:val="28"/>
           <w:szCs w:val="28"/>
         </w:rPr>
-        <w:t>Отже, у результаті виконання лабораторної роботи створено повноцінну основу інформаційної сист</w:t>
-      </w:r>
-      <w:r>
-        <w:rPr>
-          <w:rFonts w:cs="Times New Roman"/>
-          <w:sz w:val="28"/>
-          <w:szCs w:val="28"/>
-        </w:rPr>
-        <w:t>еми енергомоніторингу. Розроблене сховище можна використовувати як базу для наступних етапів: дослідницького аналізу й прогнозування енергоспоживання, моделювання системи управління енергопотоками та побудови веб-інтерфейсу для моніторингу. Робота показала</w:t>
-      </w:r>
-      <w:r>
-        <w:rPr>
-          <w:rFonts w:cs="Times New Roman"/>
-          <w:sz w:val="28"/>
-          <w:szCs w:val="28"/>
-        </w:rPr>
-        <w:t>, що правильно спроєктована структура даних є ключовою умовою для якісної аналітики, прогнозування та подальшої автоматизації енергетичного менеджменту об’єкта.</w:t>
+        <w:t>Отже, у результаті виконання лабораторної роботи створено повноцінну основу інформаційної системи енергомоніторингу. Розроблене сховище можна використовувати як базу для наступних етапів: дослідницького аналізу й прогнозування енергоспоживання, моделювання системи управління енергопотоками та побудови веб-інтерфейсу для моніторингу. Робота показала, що правильно спроєктована структура даних є ключовою умовою для якісної аналітики, прогнозування та подальшої автоматизації енергетичного менеджменту об’єкта.</w:t>
       </w:r>
     </w:p>
     <w:p>
@@ -7148,95 +5854,7 @@
           <w:sz w:val="28"/>
           <w:szCs w:val="28"/>
         </w:rPr>
-        <w:t>У цьому додатку наведено скріншоти п</w:t>
-      </w:r>
-      <w:r>
-        <w:rPr>
-          <w:rFonts w:cs="Times New Roman"/>
-          <w:sz w:val="28"/>
-          <w:szCs w:val="28"/>
-        </w:rPr>
-        <w:t xml:space="preserve">рактичної перевірки запуску першої лабораторної роботи. Вони підтверджують створення SQLite-бази даних, наявність 7 лічильників для варіанта 3, генерацію 61 320 погодинних записів за 2025 рік, роботу SQL-перевірок, формування аналітичних CSV-файлів та </w:t>
-      </w:r>
-      <w:proofErr w:type="spellStart"/>
-      <w:r>
-        <w:rPr>
-          <w:rFonts w:cs="Times New Roman"/>
-          <w:sz w:val="28"/>
-          <w:szCs w:val="28"/>
-        </w:rPr>
-        <w:t>наяв</w:t>
-      </w:r>
-      <w:r>
-        <w:rPr>
-          <w:rFonts w:cs="Times New Roman"/>
-          <w:sz w:val="28"/>
-          <w:szCs w:val="28"/>
-        </w:rPr>
-        <w:t>ність</w:t>
-      </w:r>
-      <w:proofErr w:type="spellEnd"/>
-      <w:r>
-        <w:rPr>
-          <w:rFonts w:cs="Times New Roman"/>
-          <w:sz w:val="28"/>
-          <w:szCs w:val="28"/>
-        </w:rPr>
-        <w:t xml:space="preserve"> </w:t>
-      </w:r>
-      <w:proofErr w:type="spellStart"/>
-      <w:r>
-        <w:rPr>
-          <w:rFonts w:cs="Times New Roman"/>
-          <w:sz w:val="28"/>
-          <w:szCs w:val="28"/>
-        </w:rPr>
-        <w:t>діаграми</w:t>
-      </w:r>
-      <w:proofErr w:type="spellEnd"/>
-      <w:r>
-        <w:rPr>
-          <w:rFonts w:cs="Times New Roman"/>
-          <w:sz w:val="28"/>
-          <w:szCs w:val="28"/>
-        </w:rPr>
-        <w:t xml:space="preserve"> </w:t>
-      </w:r>
-      <w:proofErr w:type="spellStart"/>
-      <w:r>
-        <w:rPr>
-          <w:rFonts w:cs="Times New Roman"/>
-          <w:sz w:val="28"/>
-          <w:szCs w:val="28"/>
-        </w:rPr>
-        <w:t>структури</w:t>
-      </w:r>
-      <w:proofErr w:type="spellEnd"/>
-      <w:r>
-        <w:rPr>
-          <w:rFonts w:cs="Times New Roman"/>
-          <w:sz w:val="28"/>
-          <w:szCs w:val="28"/>
-        </w:rPr>
-        <w:t xml:space="preserve"> </w:t>
-      </w:r>
-      <w:proofErr w:type="spellStart"/>
-      <w:r>
-        <w:rPr>
-          <w:rFonts w:cs="Times New Roman"/>
-          <w:sz w:val="28"/>
-          <w:szCs w:val="28"/>
-        </w:rPr>
-        <w:t>даних</w:t>
-      </w:r>
-      <w:proofErr w:type="spellEnd"/>
-      <w:r>
-        <w:rPr>
-          <w:rFonts w:cs="Times New Roman"/>
-          <w:sz w:val="28"/>
-          <w:szCs w:val="28"/>
-        </w:rPr>
-        <w:t>.</w:t>
+        <w:t>У цьому додатку наведено скріншоти практичної перевірки запуску першої лабораторної роботи. Вони підтверджують створення SQLite-бази даних, наявність 7 лічильників для варіанта 3, генерацію 61 320 погодинних записів за 2025 рік, роботу SQL-перевірок, формування аналітичних CSV-файлів та наявність діаграми структури даних.</w:t>
       </w:r>
     </w:p>
     <w:p>
@@ -7311,87 +5929,7 @@
           <w:szCs w:val="28"/>
         </w:rPr>
         <w:lastRenderedPageBreak/>
-        <w:t xml:space="preserve">Рисунок А.1 — Комплексна перевірка БД через термінал: кількість об’єктів, лічильників, вимірювань, метеоданих, тарифів, baseline </w:t>
-      </w:r>
-      <w:proofErr w:type="spellStart"/>
-      <w:r>
-        <w:rPr>
-          <w:rFonts w:cs="Times New Roman"/>
-          <w:i/>
-          <w:sz w:val="28"/>
-          <w:szCs w:val="28"/>
-        </w:rPr>
-        <w:t>та</w:t>
-      </w:r>
-      <w:proofErr w:type="spellEnd"/>
-      <w:r>
-        <w:rPr>
-          <w:rFonts w:cs="Times New Roman"/>
-          <w:i/>
-          <w:sz w:val="28"/>
-          <w:szCs w:val="28"/>
-        </w:rPr>
-        <w:t xml:space="preserve"> </w:t>
-      </w:r>
-      <w:proofErr w:type="spellStart"/>
-      <w:r>
-        <w:rPr>
-          <w:rFonts w:cs="Times New Roman"/>
-          <w:i/>
-          <w:sz w:val="28"/>
-          <w:szCs w:val="28"/>
-        </w:rPr>
-        <w:t>представлень</w:t>
-      </w:r>
-      <w:proofErr w:type="spellEnd"/>
-      <w:r>
-        <w:rPr>
-          <w:rFonts w:cs="Times New Roman"/>
-          <w:i/>
-          <w:sz w:val="28"/>
-          <w:szCs w:val="28"/>
-        </w:rPr>
-        <w:t xml:space="preserve"> </w:t>
-      </w:r>
-      <w:proofErr w:type="spellStart"/>
-      <w:r>
-        <w:rPr>
-          <w:rFonts w:cs="Times New Roman"/>
-          <w:i/>
-          <w:sz w:val="28"/>
-          <w:szCs w:val="28"/>
-        </w:rPr>
-        <w:t>рівнів</w:t>
-      </w:r>
-      <w:proofErr w:type="spellEnd"/>
-      <w:r>
-        <w:rPr>
-          <w:rFonts w:cs="Times New Roman"/>
-          <w:i/>
-          <w:sz w:val="28"/>
-          <w:szCs w:val="28"/>
-        </w:rPr>
-        <w:t xml:space="preserve"> </w:t>
-      </w:r>
-      <w:proofErr w:type="spellStart"/>
-      <w:r>
-        <w:rPr>
-          <w:rFonts w:cs="Times New Roman"/>
-          <w:i/>
-          <w:sz w:val="28"/>
-          <w:szCs w:val="28"/>
-        </w:rPr>
-        <w:t>обліку</w:t>
-      </w:r>
-      <w:proofErr w:type="spellEnd"/>
-      <w:r>
-        <w:rPr>
-          <w:rFonts w:cs="Times New Roman"/>
-          <w:i/>
-          <w:sz w:val="28"/>
-          <w:szCs w:val="28"/>
-        </w:rPr>
-        <w:t>.</w:t>
+        <w:t>Рисунок А.1 — Комплексна перевірка БД через термінал: кількість об’єктів, лічильників, вимірювань, метеоданих, тарифів, baseline та представлень рівнів обліку.</w:t>
       </w:r>
     </w:p>
     <w:p>
@@ -7465,36 +6003,7 @@
           <w:sz w:val="28"/>
           <w:szCs w:val="28"/>
         </w:rPr>
-        <w:t xml:space="preserve">Рисунок А.2 — Перевірка SQL-запиту SELECT </w:t>
-      </w:r>
-      <w:proofErr w:type="gramStart"/>
-      <w:r>
-        <w:rPr>
-          <w:rFonts w:cs="Times New Roman"/>
-          <w:i/>
-          <w:sz w:val="28"/>
-          <w:szCs w:val="28"/>
-        </w:rPr>
-        <w:t>COUNT(</w:t>
-      </w:r>
-      <w:proofErr w:type="gramEnd"/>
-      <w:r>
-        <w:rPr>
-          <w:rFonts w:cs="Times New Roman"/>
-          <w:i/>
-          <w:sz w:val="28"/>
-          <w:szCs w:val="28"/>
-        </w:rPr>
-        <w:t>*) FROM me</w:t>
-      </w:r>
-      <w:r>
-        <w:rPr>
-          <w:rFonts w:cs="Times New Roman"/>
-          <w:i/>
-          <w:sz w:val="28"/>
-          <w:szCs w:val="28"/>
-        </w:rPr>
-        <w:t>asurements; результат — 61 320 погодинних записів.</w:t>
+        <w:t>Рисунок А.2 — Перевірка SQL-запиту SELECT COUNT(*) FROM measurements; результат — 61 320 погодинних записів.</w:t>
       </w:r>
     </w:p>
     <w:p>
@@ -7695,8 +6204,6 @@
           <w:szCs w:val="28"/>
         </w:rPr>
       </w:pPr>
-      <w:bookmarkStart w:id="0" w:name="_GoBack"/>
-      <w:bookmarkEnd w:id="0"/>
     </w:p>
     <w:sectPr>
       <w:pgSz w:w="16834" w:h="11909" w:orient="landscape"/>
@@ -19937,7 +18444,7 @@
 </file>
 
 <file path=customXml/itemProps1.xml><?xml version="1.0" encoding="utf-8"?>
-<ds:datastoreItem xmlns:ds="http://schemas.openxmlformats.org/officeDocument/2006/customXml" ds:itemID="{ABCCEE29-91CF-424E-8AE1-6891BFCC3365}">
+<ds:datastoreItem xmlns:ds="http://schemas.openxmlformats.org/officeDocument/2006/customXml" ds:itemID="{D9EB7D48-4316-4E6D-BEB5-8522EC9B9C94}">
   <ds:schemaRefs>
     <ds:schemaRef ds:uri="http://schemas.openxmlformats.org/officeDocument/2006/bibliography"/>
   </ds:schemaRefs>

</xml_diff>